<commit_message>
comecei a preencher modelos de resumo e apresentação
</commit_message>
<xml_diff>
--- a/Documentos/MODELO RESUMO 2026 (1).docx
+++ b/Documentos/MODELO RESUMO 2026 (1).docx
@@ -98,17 +98,68 @@
               </w:rPr>
             </w:rPrChange>
           </w:rPr>
-          <w:t>ISABELLA LUIZA DOS SANTOS SOUZA, E</w:t>
+          <w:t xml:space="preserve">ISABELLA LUIZA DOS SANTOS SOUZA, </w:t>
         </w:r>
       </w:ins>
-      <w:ins w:id="7" w:author="Isabella" w:date="2026-10-06T19:11:00Z">
+      <w:ins w:id="7" w:author="NATHAN GABRIEL NUNES DOS SANTOS" w:date="2026-10-08T20:24:00Z">
         <w:r>
           <w:rPr>
             <w:rFonts w:ascii="Times New Roman" w:hAnsi="Times New Roman" w:cs="Times New Roman"/>
             <w:color w:val="000000" w:themeColor="text1"/>
             <w:sz w:val="24"/>
             <w:szCs w:val="24"/>
-            <w:rPrChange w:id="8" w:author="Isabella" w:date="2026-10-06T20:20:00Z">
+          </w:rPr>
+          <w:t>ORIENTADORA</w:t>
+        </w:r>
+      </w:ins>
+      <w:ins w:id="8" w:author="Isabella" w:date="2026-10-06T19:05:00Z">
+        <w:del w:id="9" w:author="NATHAN GABRIEL NUNES DOS SANTOS" w:date="2026-10-08T20:24:00Z">
+          <w:r>
+            <w:rPr>
+              <w:rFonts w:ascii="Times New Roman" w:hAnsi="Times New Roman" w:cs="Times New Roman"/>
+              <w:color w:val="000000" w:themeColor="text1"/>
+              <w:sz w:val="24"/>
+              <w:szCs w:val="24"/>
+              <w:rPrChange w:id="10" w:author="Isabella" w:date="2026-10-06T20:20:00Z">
+                <w:rPr>
+                  <w:rFonts w:ascii="Times New Roman" w:hAnsi="Times New Roman" w:cs="Times New Roman"/>
+                  <w:color w:val="1F4E79"/>
+                  <w:sz w:val="24"/>
+                  <w:szCs w:val="24"/>
+                </w:rPr>
+              </w:rPrChange>
+            </w:rPr>
+            <w:delText>E</w:delText>
+          </w:r>
+        </w:del>
+      </w:ins>
+      <w:ins w:id="11" w:author="Isabella" w:date="2026-10-06T19:11:00Z">
+        <w:del w:id="12" w:author="NATHAN GABRIEL NUNES DOS SANTOS" w:date="2026-10-08T20:24:00Z">
+          <w:r>
+            <w:rPr>
+              <w:rFonts w:ascii="Times New Roman" w:hAnsi="Times New Roman" w:cs="Times New Roman"/>
+              <w:color w:val="000000" w:themeColor="text1"/>
+              <w:sz w:val="24"/>
+              <w:szCs w:val="24"/>
+              <w:rPrChange w:id="13" w:author="Isabella" w:date="2026-10-06T20:20:00Z">
+                <w:rPr>
+                  <w:rFonts w:ascii="Times New Roman" w:hAnsi="Times New Roman" w:cs="Times New Roman"/>
+                  <w:color w:val="1F4E79"/>
+                  <w:sz w:val="24"/>
+                  <w:szCs w:val="24"/>
+                </w:rPr>
+              </w:rPrChange>
+            </w:rPr>
+            <w:delText>SPECIALISTA</w:delText>
+          </w:r>
+        </w:del>
+        <w:r>
+          <w:rPr>
+            <w:rFonts w:ascii="Times New Roman" w:hAnsi="Times New Roman" w:cs="Times New Roman"/>
+            <w:color w:val="000000" w:themeColor="text1"/>
+            <w:sz w:val="24"/>
+            <w:szCs w:val="24"/>
+            <w:rPrChange w:id="14" w:author="Isabella" w:date="2026-10-06T20:20:00Z">
               <w:rPr>
                 <w:rFonts w:ascii="Times New Roman" w:hAnsi="Times New Roman" w:cs="Times New Roman"/>
                 <w:color w:val="1F4E79"/>
@@ -117,17 +168,17 @@
               </w:rPr>
             </w:rPrChange>
           </w:rPr>
-          <w:t>SPECIALISTA.</w:t>
+          <w:t>.</w:t>
         </w:r>
       </w:ins>
-      <w:del w:id="9" w:author="Isabella" w:date="2026-10-06T19:05:00Z">
+      <w:del w:id="15" w:author="Isabella" w:date="2026-10-06T19:05:00Z">
         <w:r>
           <w:rPr>
             <w:rFonts w:ascii="Times New Roman" w:hAnsi="Times New Roman" w:cs="Times New Roman"/>
             <w:color w:val="000000" w:themeColor="text1"/>
             <w:sz w:val="24"/>
             <w:szCs w:val="24"/>
-            <w:rPrChange w:id="10" w:author="Isabella" w:date="2026-10-06T20:20:00Z">
+            <w:rPrChange w:id="16" w:author="Isabella" w:date="2026-10-06T20:20:00Z">
               <w:rPr>
                 <w:rFonts w:ascii="Times New Roman" w:hAnsi="Times New Roman" w:cs="Times New Roman"/>
                 <w:color w:val="1F4E79"/>
@@ -146,7 +197,7 @@
           <w:color w:val="000000" w:themeColor="text1"/>
           <w:sz w:val="24"/>
           <w:szCs w:val="24"/>
-          <w:rPrChange w:id="11" w:author="Isabella" w:date="2026-10-06T20:20:00Z">
+          <w:rPrChange w:id="17" w:author="Isabella" w:date="2026-10-06T20:20:00Z">
             <w:rPr>
               <w:rStyle w:val="Refdenotaderodap"/>
               <w:rFonts w:ascii="Times New Roman" w:hAnsi="Times New Roman" w:cs="Times New Roman"/>
@@ -168,7 +219,7 @@
           <w:color w:val="000000" w:themeColor="text1"/>
           <w:sz w:val="24"/>
           <w:szCs w:val="24"/>
-          <w:rPrChange w:id="38" w:author="Isabella" w:date="2026-10-06T20:20:00Z">
+          <w:rPrChange w:id="44" w:author="Isabella" w:date="2026-10-06T20:20:00Z">
             <w:rPr>
               <w:rFonts w:ascii="Times New Roman" w:hAnsi="Times New Roman" w:cs="Times New Roman"/>
               <w:sz w:val="24"/>
@@ -177,13 +228,43 @@
           </w:rPrChange>
         </w:rPr>
       </w:pPr>
-      <w:r>
-        <w:rPr>
-          <w:rFonts w:ascii="Times New Roman" w:hAnsi="Times New Roman" w:cs="Times New Roman"/>
-          <w:color w:val="000000" w:themeColor="text1"/>
-          <w:sz w:val="24"/>
-          <w:szCs w:val="24"/>
-          <w:rPrChange w:id="39" w:author="Isabella" w:date="2026-10-06T20:20:00Z">
+      <w:ins w:id="45" w:author="NATHAN GABRIEL NUNES DOS SANTOS" w:date="2026-10-08T20:24:00Z">
+        <w:r>
+          <w:rPr>
+            <w:rFonts w:ascii="Times New Roman" w:hAnsi="Times New Roman" w:cs="Times New Roman"/>
+            <w:color w:val="000000" w:themeColor="text1"/>
+            <w:sz w:val="24"/>
+            <w:szCs w:val="24"/>
+          </w:rPr>
+          <w:t>[Nathan Gabriel Nunes dos Santos</w:t>
+        </w:r>
+      </w:ins>
+      <w:del w:id="46" w:author="NATHAN GABRIEL NUNES DOS SANTOS" w:date="2026-10-08T20:24:00Z">
+        <w:r>
+          <w:rPr>
+            <w:rFonts w:ascii="Times New Roman" w:hAnsi="Times New Roman" w:cs="Times New Roman"/>
+            <w:color w:val="000000" w:themeColor="text1"/>
+            <w:sz w:val="24"/>
+            <w:szCs w:val="24"/>
+            <w:rPrChange w:id="47" w:author="Isabella" w:date="2026-10-06T20:20:00Z">
+              <w:rPr>
+                <w:rFonts w:ascii="Times New Roman" w:hAnsi="Times New Roman" w:cs="Times New Roman"/>
+                <w:color w:val="1F4E79"/>
+                <w:sz w:val="24"/>
+                <w:szCs w:val="24"/>
+              </w:rPr>
+            </w:rPrChange>
+          </w:rPr>
+          <w:delText>[NOME COMPLETO DO ALUNO 1</w:delText>
+        </w:r>
+      </w:del>
+      <w:r>
+        <w:rPr>
+          <w:rFonts w:ascii="Times New Roman" w:hAnsi="Times New Roman" w:cs="Times New Roman"/>
+          <w:color w:val="000000" w:themeColor="text1"/>
+          <w:sz w:val="24"/>
+          <w:szCs w:val="24"/>
+          <w:rPrChange w:id="48" w:author="Isabella" w:date="2026-10-06T20:20:00Z">
             <w:rPr>
               <w:rFonts w:ascii="Times New Roman" w:hAnsi="Times New Roman" w:cs="Times New Roman"/>
               <w:color w:val="1F4E79"/>
@@ -192,7 +273,7 @@
             </w:rPr>
           </w:rPrChange>
         </w:rPr>
-        <w:t>[NOME COMPLETO DO ALUNO 1]</w:t>
+        <w:t>]</w:t>
       </w:r>
       <w:r>
         <w:rPr>
@@ -201,7 +282,7 @@
           <w:color w:val="000000" w:themeColor="text1"/>
           <w:sz w:val="24"/>
           <w:szCs w:val="24"/>
-          <w:rPrChange w:id="40" w:author="Isabella" w:date="2026-10-06T20:20:00Z">
+          <w:rPrChange w:id="49" w:author="Isabella" w:date="2026-10-06T20:20:00Z">
             <w:rPr>
               <w:rStyle w:val="Refdenotaderodap"/>
               <w:rFonts w:ascii="Times New Roman" w:hAnsi="Times New Roman" w:cs="Times New Roman"/>
@@ -219,12 +300,14 @@
         <w:ind w:firstLine="709"/>
         <w:jc w:val="right"/>
         <w:rPr>
-          <w:rFonts w:ascii="Times New Roman" w:hAnsi="Times New Roman" w:cs="Times New Roman"/>
-          <w:color w:val="000000" w:themeColor="text1"/>
-          <w:sz w:val="24"/>
-          <w:szCs w:val="24"/>
-          <w:rPrChange w:id="45" w:author="Isabella" w:date="2026-10-06T20:20:00Z">
-            <w:rPr>
+          <w:del w:id="61" w:author="NATHAN GABRIEL NUNES DOS SANTOS" w:date="2026-10-08T20:24:00Z"/>
+          <w:rFonts w:ascii="Times New Roman" w:hAnsi="Times New Roman" w:cs="Times New Roman"/>
+          <w:color w:val="000000" w:themeColor="text1"/>
+          <w:sz w:val="24"/>
+          <w:szCs w:val="24"/>
+          <w:rPrChange w:id="62" w:author="Isabella" w:date="2026-10-06T20:20:00Z">
+            <w:rPr>
+              <w:del w:id="63" w:author="NATHAN GABRIEL NUNES DOS SANTOS" w:date="2026-10-08T20:24:00Z"/>
               <w:rFonts w:ascii="Times New Roman" w:hAnsi="Times New Roman" w:cs="Times New Roman"/>
               <w:sz w:val="24"/>
               <w:szCs w:val="24"/>
@@ -232,41 +315,43 @@
           </w:rPrChange>
         </w:rPr>
       </w:pPr>
-      <w:r>
-        <w:rPr>
-          <w:rFonts w:ascii="Times New Roman" w:hAnsi="Times New Roman" w:cs="Times New Roman"/>
-          <w:color w:val="000000" w:themeColor="text1"/>
-          <w:sz w:val="24"/>
-          <w:szCs w:val="24"/>
-          <w:rPrChange w:id="46" w:author="Isabella" w:date="2026-10-06T20:20:00Z">
-            <w:rPr>
-              <w:rFonts w:ascii="Times New Roman" w:hAnsi="Times New Roman" w:cs="Times New Roman"/>
-              <w:color w:val="1F4E79"/>
-              <w:sz w:val="24"/>
-              <w:szCs w:val="24"/>
-            </w:rPr>
-          </w:rPrChange>
-        </w:rPr>
-        <w:t>[NOME COMPLETO DO ALUNO 2 OU EXCLUIR ESTA LINHA]</w:t>
-      </w:r>
-      <w:r>
-        <w:rPr>
-          <w:rStyle w:val="Refdenotaderodap"/>
-          <w:rFonts w:ascii="Times New Roman" w:hAnsi="Times New Roman" w:cs="Times New Roman"/>
-          <w:color w:val="000000" w:themeColor="text1"/>
-          <w:sz w:val="24"/>
-          <w:szCs w:val="24"/>
-          <w:rPrChange w:id="47" w:author="Isabella" w:date="2026-10-06T20:20:00Z">
-            <w:rPr>
-              <w:rStyle w:val="Refdenotaderodap"/>
-              <w:rFonts w:ascii="Times New Roman" w:hAnsi="Times New Roman" w:cs="Times New Roman"/>
-              <w:sz w:val="24"/>
-              <w:szCs w:val="24"/>
-            </w:rPr>
-          </w:rPrChange>
-        </w:rPr>
-        <w:footnoteReference w:id="3"/>
-      </w:r>
+      <w:del w:id="64" w:author="NATHAN GABRIEL NUNES DOS SANTOS" w:date="2026-10-08T20:24:00Z">
+        <w:r>
+          <w:rPr>
+            <w:rFonts w:ascii="Times New Roman" w:hAnsi="Times New Roman" w:cs="Times New Roman"/>
+            <w:color w:val="000000" w:themeColor="text1"/>
+            <w:sz w:val="24"/>
+            <w:szCs w:val="24"/>
+            <w:rPrChange w:id="65" w:author="Isabella" w:date="2026-10-06T20:20:00Z">
+              <w:rPr>
+                <w:rFonts w:ascii="Times New Roman" w:hAnsi="Times New Roman" w:cs="Times New Roman"/>
+                <w:color w:val="1F4E79"/>
+                <w:sz w:val="24"/>
+                <w:szCs w:val="24"/>
+              </w:rPr>
+            </w:rPrChange>
+          </w:rPr>
+          <w:delText>[NOME COMPLETO DO ALUNO 2 OU EXCLUIR ESTA LINHA]</w:delText>
+        </w:r>
+        <w:r>
+          <w:rPr>
+            <w:rStyle w:val="Refdenotaderodap"/>
+            <w:rFonts w:ascii="Times New Roman" w:hAnsi="Times New Roman" w:cs="Times New Roman"/>
+            <w:color w:val="000000" w:themeColor="text1"/>
+            <w:sz w:val="24"/>
+            <w:szCs w:val="24"/>
+            <w:rPrChange w:id="66" w:author="Isabella" w:date="2026-10-06T20:20:00Z">
+              <w:rPr>
+                <w:rStyle w:val="Refdenotaderodap"/>
+                <w:rFonts w:ascii="Times New Roman" w:hAnsi="Times New Roman" w:cs="Times New Roman"/>
+                <w:sz w:val="24"/>
+                <w:szCs w:val="24"/>
+              </w:rPr>
+            </w:rPrChange>
+          </w:rPr>
+          <w:footnoteReference w:id="3"/>
+        </w:r>
+      </w:del>
     </w:p>
     <w:p>
       <w:pPr>
@@ -278,7 +363,7 @@
           <w:color w:val="000000" w:themeColor="text1"/>
           <w:sz w:val="24"/>
           <w:szCs w:val="24"/>
-          <w:rPrChange w:id="51" w:author="Isabella" w:date="2026-10-06T20:20:00Z">
+          <w:rPrChange w:id="72" w:author="Isabella" w:date="2026-10-06T20:20:00Z">
             <w:rPr>
               <w:rFonts w:ascii="Times New Roman" w:hAnsi="Times New Roman" w:cs="Times New Roman"/>
               <w:sz w:val="24"/>
@@ -287,58 +372,60 @@
           </w:rPrChange>
         </w:rPr>
       </w:pPr>
-      <w:r>
-        <w:rPr>
-          <w:rFonts w:ascii="Times New Roman" w:hAnsi="Times New Roman" w:cs="Times New Roman"/>
-          <w:color w:val="000000" w:themeColor="text1"/>
-          <w:sz w:val="24"/>
-          <w:szCs w:val="24"/>
-          <w:rPrChange w:id="52" w:author="Isabella" w:date="2026-10-06T20:20:00Z">
-            <w:rPr>
-              <w:rFonts w:ascii="Times New Roman" w:hAnsi="Times New Roman" w:cs="Times New Roman"/>
-              <w:color w:val="1F4E79"/>
-              <w:sz w:val="24"/>
-              <w:szCs w:val="24"/>
-            </w:rPr>
-          </w:rPrChange>
-        </w:rPr>
-        <w:t>[NOME COMPLETO DO ALUNO 3 OU EXCLUIR ESTA LINHA]</w:t>
-      </w:r>
-      <w:r>
-        <w:rPr>
-          <w:rStyle w:val="Refdenotaderodap"/>
-          <w:rFonts w:ascii="Times New Roman" w:hAnsi="Times New Roman" w:cs="Times New Roman"/>
-          <w:color w:val="000000" w:themeColor="text1"/>
-          <w:sz w:val="24"/>
-          <w:szCs w:val="24"/>
-          <w:rPrChange w:id="53" w:author="Isabella" w:date="2026-10-06T20:20:00Z">
-            <w:rPr>
-              <w:rStyle w:val="Refdenotaderodap"/>
-              <w:rFonts w:ascii="Times New Roman" w:hAnsi="Times New Roman" w:cs="Times New Roman"/>
-              <w:sz w:val="24"/>
-              <w:szCs w:val="24"/>
-            </w:rPr>
-          </w:rPrChange>
-        </w:rPr>
-        <w:footnoteReference w:id="4"/>
-      </w:r>
-      <w:commentRangeEnd w:id="3"/>
-      <w:r>
-        <w:rPr>
-          <w:rStyle w:val="Refdecomentrio"/>
-          <w:rFonts w:ascii="Times New Roman" w:hAnsi="Times New Roman"/>
-          <w:color w:val="000000" w:themeColor="text1"/>
-          <w:sz w:val="24"/>
-          <w:rPrChange w:id="57" w:author="Isabella" w:date="2026-10-06T20:20:00Z">
-            <w:rPr>
-              <w:rStyle w:val="Refdecomentrio"/>
-              <w:rFonts w:ascii="Times New Roman" w:hAnsi="Times New Roman"/>
-              <w:sz w:val="24"/>
-            </w:rPr>
-          </w:rPrChange>
-        </w:rPr>
-        <w:commentReference w:id="3"/>
-      </w:r>
+      <w:del w:id="73" w:author="NATHAN GABRIEL NUNES DOS SANTOS" w:date="2026-10-08T20:24:00Z">
+        <w:r>
+          <w:rPr>
+            <w:rFonts w:ascii="Times New Roman" w:hAnsi="Times New Roman" w:cs="Times New Roman"/>
+            <w:color w:val="000000" w:themeColor="text1"/>
+            <w:sz w:val="24"/>
+            <w:szCs w:val="24"/>
+            <w:rPrChange w:id="74" w:author="Isabella" w:date="2026-10-06T20:20:00Z">
+              <w:rPr>
+                <w:rFonts w:ascii="Times New Roman" w:hAnsi="Times New Roman" w:cs="Times New Roman"/>
+                <w:color w:val="1F4E79"/>
+                <w:sz w:val="24"/>
+                <w:szCs w:val="24"/>
+              </w:rPr>
+            </w:rPrChange>
+          </w:rPr>
+          <w:delText>[NOME COMPLETO DO ALUNO 3 OU EXCLUIR ESTA LINHA]</w:delText>
+        </w:r>
+        <w:r>
+          <w:rPr>
+            <w:rStyle w:val="Refdenotaderodap"/>
+            <w:rFonts w:ascii="Times New Roman" w:hAnsi="Times New Roman" w:cs="Times New Roman"/>
+            <w:color w:val="000000" w:themeColor="text1"/>
+            <w:sz w:val="24"/>
+            <w:szCs w:val="24"/>
+            <w:rPrChange w:id="75" w:author="Isabella" w:date="2026-10-06T20:20:00Z">
+              <w:rPr>
+                <w:rStyle w:val="Refdenotaderodap"/>
+                <w:rFonts w:ascii="Times New Roman" w:hAnsi="Times New Roman" w:cs="Times New Roman"/>
+                <w:sz w:val="24"/>
+                <w:szCs w:val="24"/>
+              </w:rPr>
+            </w:rPrChange>
+          </w:rPr>
+          <w:footnoteReference w:id="4"/>
+        </w:r>
+        <w:commentRangeEnd w:id="3"/>
+        <w:r>
+          <w:rPr>
+            <w:rStyle w:val="Refdecomentrio"/>
+            <w:rFonts w:ascii="Times New Roman" w:hAnsi="Times New Roman"/>
+            <w:color w:val="000000" w:themeColor="text1"/>
+            <w:sz w:val="24"/>
+            <w:rPrChange w:id="81" w:author="Isabella" w:date="2026-10-06T20:20:00Z">
+              <w:rPr>
+                <w:rStyle w:val="Refdecomentrio"/>
+                <w:rFonts w:ascii="Times New Roman" w:hAnsi="Times New Roman"/>
+                <w:sz w:val="24"/>
+              </w:rPr>
+            </w:rPrChange>
+          </w:rPr>
+          <w:commentReference w:id="3"/>
+        </w:r>
+      </w:del>
     </w:p>
     <w:p>
       <w:pPr>
@@ -350,7 +437,7 @@
           <w:color w:val="000000" w:themeColor="text1"/>
           <w:sz w:val="24"/>
           <w:szCs w:val="24"/>
-          <w:rPrChange w:id="58" w:author="Isabella" w:date="2026-10-06T20:20:00Z">
+          <w:rPrChange w:id="82" w:author="Isabella" w:date="2026-10-06T20:20:00Z">
             <w:rPr>
               <w:rFonts w:ascii="Times New Roman" w:hAnsi="Times New Roman" w:cs="Times New Roman"/>
               <w:sz w:val="24"/>
@@ -371,7 +458,7 @@
           <w:color w:val="000000" w:themeColor="text1"/>
           <w:sz w:val="24"/>
           <w:szCs w:val="24"/>
-          <w:rPrChange w:id="59" w:author="Isabella" w:date="2026-10-06T20:20:00Z">
+          <w:rPrChange w:id="83" w:author="Isabella" w:date="2026-10-06T20:20:00Z">
             <w:rPr>
               <w:rFonts w:ascii="Times New Roman" w:hAnsi="Times New Roman" w:cs="Times New Roman"/>
               <w:b/>
@@ -392,7 +479,7 @@
           <w:color w:val="000000" w:themeColor="text1"/>
           <w:sz w:val="24"/>
           <w:szCs w:val="24"/>
-          <w:rPrChange w:id="60" w:author="Isabella" w:date="2026-10-06T20:20:00Z">
+          <w:rPrChange w:id="84" w:author="Isabella" w:date="2026-10-06T20:20:00Z">
             <w:rPr>
               <w:rFonts w:ascii="Times New Roman" w:hAnsi="Times New Roman" w:cs="Times New Roman"/>
               <w:b/>
@@ -413,7 +500,7 @@
           <w:color w:val="000000" w:themeColor="text1"/>
           <w:sz w:val="24"/>
           <w:szCs w:val="24"/>
-          <w:rPrChange w:id="61" w:author="Isabella" w:date="2026-10-06T20:20:00Z">
+          <w:rPrChange w:id="85" w:author="Isabella" w:date="2026-10-06T20:20:00Z">
             <w:rPr>
               <w:rFonts w:ascii="Times New Roman" w:hAnsi="Times New Roman" w:cs="Times New Roman"/>
               <w:b/>
@@ -429,15 +516,15 @@
         <w:spacing w:after="0" w:line="240" w:lineRule="auto"/>
         <w:jc w:val="both"/>
         <w:rPr>
-          <w:del w:id="62" w:author="Isabella" w:date="2026-10-06T19:05:00Z"/>
+          <w:del w:id="86" w:author="Isabella" w:date="2026-10-06T19:05:00Z"/>
           <w:rFonts w:ascii="Times New Roman" w:hAnsi="Times New Roman" w:cs="Times New Roman"/>
           <w:b/>
           <w:color w:val="000000" w:themeColor="text1"/>
           <w:sz w:val="24"/>
           <w:szCs w:val="24"/>
-          <w:rPrChange w:id="63" w:author="Isabella" w:date="2026-10-06T20:20:00Z">
-            <w:rPr>
-              <w:del w:id="64" w:author="Isabella" w:date="2026-10-06T19:05:00Z"/>
+          <w:rPrChange w:id="87" w:author="Isabella" w:date="2026-10-06T20:20:00Z">
+            <w:rPr>
+              <w:del w:id="88" w:author="Isabella" w:date="2026-10-06T19:05:00Z"/>
               <w:rFonts w:ascii="Times New Roman" w:hAnsi="Times New Roman" w:cs="Times New Roman"/>
               <w:b/>
               <w:sz w:val="24"/>
@@ -446,7 +533,7 @@
           </w:rPrChange>
         </w:rPr>
       </w:pPr>
-      <w:commentRangeStart w:id="65"/>
+      <w:commentRangeStart w:id="89"/>
       <w:r>
         <w:rPr>
           <w:rFonts w:ascii="Times New Roman" w:hAnsi="Times New Roman" w:cs="Times New Roman"/>
@@ -454,7 +541,7 @@
           <w:color w:val="000000" w:themeColor="text1"/>
           <w:sz w:val="24"/>
           <w:szCs w:val="24"/>
-          <w:rPrChange w:id="66" w:author="Isabella" w:date="2026-10-06T20:20:00Z">
+          <w:rPrChange w:id="90" w:author="Isabella" w:date="2026-10-06T20:20:00Z">
             <w:rPr>
               <w:rFonts w:ascii="Times New Roman" w:hAnsi="Times New Roman" w:cs="Times New Roman"/>
               <w:b/>
@@ -465,7 +552,7 @@
         </w:rPr>
         <w:t>RESUMO</w:t>
       </w:r>
-      <w:commentRangeEnd w:id="65"/>
+      <w:commentRangeEnd w:id="89"/>
       <w:r>
         <w:rPr>
           <w:rStyle w:val="Refdecomentrio"/>
@@ -474,7 +561,7 @@
           <w:color w:val="000000" w:themeColor="text1"/>
           <w:sz w:val="24"/>
           <w:szCs w:val="24"/>
-          <w:rPrChange w:id="67" w:author="Isabella" w:date="2026-10-06T20:20:00Z">
+          <w:rPrChange w:id="91" w:author="Isabella" w:date="2026-10-06T20:20:00Z">
             <w:rPr>
               <w:rStyle w:val="Refdecomentrio"/>
               <w:rFonts w:ascii="Times New Roman" w:hAnsi="Times New Roman" w:cs="Times New Roman"/>
@@ -484,7 +571,7 @@
             </w:rPr>
           </w:rPrChange>
         </w:rPr>
-        <w:commentReference w:id="65"/>
+        <w:commentReference w:id="89"/>
       </w:r>
     </w:p>
     <w:p>
@@ -492,15 +579,15 @@
         <w:spacing w:after="0" w:line="240" w:lineRule="auto"/>
         <w:jc w:val="both"/>
         <w:rPr>
-          <w:del w:id="68" w:author="Isabella" w:date="2026-10-06T19:05:00Z"/>
+          <w:del w:id="92" w:author="Isabella" w:date="2026-10-06T19:05:00Z"/>
           <w:rFonts w:ascii="Times New Roman" w:hAnsi="Times New Roman" w:cs="Times New Roman"/>
           <w:b/>
           <w:color w:val="000000" w:themeColor="text1"/>
           <w:sz w:val="24"/>
           <w:szCs w:val="24"/>
-          <w:rPrChange w:id="69" w:author="Isabella" w:date="2026-10-06T20:20:00Z">
-            <w:rPr>
-              <w:del w:id="70" w:author="Isabella" w:date="2026-10-06T19:05:00Z"/>
+          <w:rPrChange w:id="93" w:author="Isabella" w:date="2026-10-06T20:20:00Z">
+            <w:rPr>
+              <w:del w:id="94" w:author="Isabella" w:date="2026-10-06T19:05:00Z"/>
               <w:rFonts w:ascii="Times New Roman" w:hAnsi="Times New Roman" w:cs="Times New Roman"/>
               <w:b/>
               <w:sz w:val="24"/>
@@ -520,7 +607,7 @@
           <w:color w:val="000000" w:themeColor="text1"/>
           <w:sz w:val="24"/>
           <w:szCs w:val="24"/>
-          <w:rPrChange w:id="71" w:author="Isabella" w:date="2026-10-06T20:20:00Z">
+          <w:rPrChange w:id="95" w:author="Isabella" w:date="2026-10-06T20:20:00Z">
             <w:rPr>
               <w:rFonts w:ascii="Times New Roman" w:hAnsi="Times New Roman" w:cs="Times New Roman"/>
               <w:sz w:val="24"/>
@@ -528,20 +615,20 @@
             </w:rPr>
           </w:rPrChange>
         </w:rPr>
-        <w:pPrChange w:id="72" w:author="Isabella" w:date="2026-10-06T19:05:00Z">
+        <w:pPrChange w:id="96" w:author="Isabella" w:date="2026-10-06T19:05:00Z">
           <w:pPr>
             <w:spacing w:after="0" w:line="360" w:lineRule="auto"/>
           </w:pPr>
         </w:pPrChange>
       </w:pPr>
-      <w:del w:id="73" w:author="Isabella" w:date="2026-10-06T19:05:00Z">
+      <w:del w:id="97" w:author="Isabella" w:date="2026-10-06T19:05:00Z">
         <w:r>
           <w:rPr>
             <w:rFonts w:ascii="Times New Roman" w:hAnsi="Times New Roman"/>
             <w:b/>
             <w:color w:val="000000" w:themeColor="text1"/>
             <w:sz w:val="24"/>
-            <w:rPrChange w:id="74" w:author="Isabella" w:date="2026-10-06T20:20:00Z">
+            <w:rPrChange w:id="98" w:author="Isabella" w:date="2026-10-06T20:20:00Z">
               <w:rPr>
                 <w:rFonts w:ascii="Times New Roman" w:hAnsi="Times New Roman"/>
                 <w:b/>
@@ -558,7 +645,7 @@
             <w:i/>
             <w:color w:val="000000" w:themeColor="text1"/>
             <w:sz w:val="24"/>
-            <w:rPrChange w:id="75" w:author="Isabella" w:date="2026-10-06T20:20:00Z">
+            <w:rPrChange w:id="99" w:author="Isabella" w:date="2026-10-06T20:20:00Z">
               <w:rPr>
                 <w:rFonts w:ascii="Times New Roman" w:hAnsi="Times New Roman"/>
                 <w:i/>
@@ -576,7 +663,7 @@
           <w:i/>
           <w:color w:val="000000" w:themeColor="text1"/>
           <w:sz w:val="24"/>
-          <w:rPrChange w:id="76" w:author="Isabella" w:date="2026-10-06T20:20:00Z">
+          <w:rPrChange w:id="100" w:author="Isabella" w:date="2026-10-06T20:20:00Z">
             <w:rPr>
               <w:rFonts w:ascii="Times New Roman" w:hAnsi="Times New Roman"/>
               <w:i/>
@@ -593,7 +680,7 @@
           <w:i/>
           <w:color w:val="000000" w:themeColor="text1"/>
           <w:sz w:val="24"/>
-          <w:rPrChange w:id="77" w:author="Isabella" w:date="2026-10-06T20:20:00Z">
+          <w:rPrChange w:id="101" w:author="Isabella" w:date="2026-10-06T20:20:00Z">
             <w:rPr>
               <w:rFonts w:ascii="Times New Roman" w:hAnsi="Times New Roman"/>
               <w:i/>
@@ -610,7 +697,7 @@
           <w:bCs/>
           <w:color w:val="000000" w:themeColor="text1"/>
           <w:sz w:val="24"/>
-          <w:rPrChange w:id="78" w:author="Isabella" w:date="2026-10-06T20:20:00Z">
+          <w:rPrChange w:id="102" w:author="Isabella" w:date="2026-10-06T20:20:00Z">
             <w:rPr>
               <w:rFonts w:ascii="Times New Roman" w:hAnsi="Times New Roman"/>
               <w:b/>
@@ -627,7 +714,7 @@
           <w:bCs/>
           <w:color w:val="000000" w:themeColor="text1"/>
           <w:sz w:val="24"/>
-          <w:rPrChange w:id="79" w:author="Isabella" w:date="2026-10-06T20:20:00Z">
+          <w:rPrChange w:id="103" w:author="Isabella" w:date="2026-10-06T20:20:00Z">
             <w:rPr>
               <w:rFonts w:ascii="Times New Roman" w:hAnsi="Times New Roman"/>
               <w:sz w:val="24"/>
@@ -642,7 +729,7 @@
           <w:bCs/>
           <w:color w:val="000000" w:themeColor="text1"/>
           <w:sz w:val="24"/>
-          <w:rPrChange w:id="80" w:author="Isabella" w:date="2026-10-06T20:20:00Z">
+          <w:rPrChange w:id="104" w:author="Isabella" w:date="2026-10-06T20:20:00Z">
             <w:rPr>
               <w:rFonts w:ascii="Times New Roman" w:hAnsi="Times New Roman"/>
               <w:b/>
@@ -659,7 +746,7 @@
           <w:bCs/>
           <w:color w:val="000000" w:themeColor="text1"/>
           <w:sz w:val="24"/>
-          <w:rPrChange w:id="81" w:author="Isabella" w:date="2026-10-06T20:20:00Z">
+          <w:rPrChange w:id="105" w:author="Isabella" w:date="2026-10-06T20:20:00Z">
             <w:rPr>
               <w:rFonts w:ascii="Times New Roman" w:hAnsi="Times New Roman"/>
               <w:sz w:val="24"/>
@@ -674,7 +761,7 @@
           <w:bCs/>
           <w:color w:val="000000" w:themeColor="text1"/>
           <w:sz w:val="24"/>
-          <w:rPrChange w:id="82" w:author="Isabella" w:date="2026-10-06T20:20:00Z">
+          <w:rPrChange w:id="106" w:author="Isabella" w:date="2026-10-06T20:20:00Z">
             <w:rPr>
               <w:rFonts w:ascii="Times New Roman" w:hAnsi="Times New Roman"/>
               <w:b/>
@@ -691,7 +778,7 @@
           <w:bCs/>
           <w:color w:val="000000" w:themeColor="text1"/>
           <w:sz w:val="24"/>
-          <w:rPrChange w:id="83" w:author="Isabella" w:date="2026-10-06T20:20:00Z">
+          <w:rPrChange w:id="107" w:author="Isabella" w:date="2026-10-06T20:20:00Z">
             <w:rPr>
               <w:rFonts w:ascii="Times New Roman" w:hAnsi="Times New Roman"/>
               <w:sz w:val="24"/>
@@ -706,7 +793,7 @@
           <w:bCs/>
           <w:color w:val="000000" w:themeColor="text1"/>
           <w:sz w:val="24"/>
-          <w:rPrChange w:id="84" w:author="Isabella" w:date="2026-10-06T20:20:00Z">
+          <w:rPrChange w:id="108" w:author="Isabella" w:date="2026-10-06T20:20:00Z">
             <w:rPr>
               <w:rFonts w:ascii="Times New Roman" w:hAnsi="Times New Roman"/>
               <w:b/>
@@ -727,7 +814,7 @@
           <w:color w:val="000000" w:themeColor="text1"/>
           <w:sz w:val="24"/>
           <w:szCs w:val="24"/>
-          <w:rPrChange w:id="85" w:author="Isabella" w:date="2026-10-06T20:20:00Z">
+          <w:rPrChange w:id="109" w:author="Isabella" w:date="2026-10-06T20:20:00Z">
             <w:rPr>
               <w:rFonts w:ascii="Times New Roman" w:hAnsi="Times New Roman" w:cs="Times New Roman"/>
               <w:sz w:val="24"/>
@@ -746,7 +833,7 @@
           <w:color w:val="000000" w:themeColor="text1"/>
           <w:sz w:val="24"/>
           <w:szCs w:val="24"/>
-          <w:rPrChange w:id="86" w:author="Isabella" w:date="2026-10-06T20:20:00Z">
+          <w:rPrChange w:id="110" w:author="Isabella" w:date="2026-10-06T20:20:00Z">
             <w:rPr>
               <w:rFonts w:ascii="Times New Roman" w:hAnsi="Times New Roman" w:cs="Times New Roman"/>
               <w:sz w:val="24"/>
@@ -761,7 +848,7 @@
           <w:b/>
           <w:color w:val="000000" w:themeColor="text1"/>
           <w:sz w:val="24"/>
-          <w:rPrChange w:id="87" w:author="Isabella" w:date="2026-10-06T20:20:00Z">
+          <w:rPrChange w:id="111" w:author="Isabella" w:date="2026-10-06T20:20:00Z">
             <w:rPr>
               <w:rFonts w:ascii="Times New Roman" w:hAnsi="Times New Roman"/>
               <w:b/>
@@ -776,7 +863,7 @@
           <w:rFonts w:ascii="Times New Roman" w:hAnsi="Times New Roman"/>
           <w:color w:val="000000" w:themeColor="text1"/>
           <w:sz w:val="24"/>
-          <w:rPrChange w:id="88" w:author="Isabella" w:date="2026-10-06T20:20:00Z">
+          <w:rPrChange w:id="112" w:author="Isabella" w:date="2026-10-06T20:20:00Z">
             <w:rPr>
               <w:rFonts w:ascii="Times New Roman" w:hAnsi="Times New Roman"/>
               <w:color w:val="1F4E79"/>
@@ -797,7 +884,7 @@
           <w:color w:val="000000" w:themeColor="text1"/>
           <w:sz w:val="24"/>
           <w:szCs w:val="24"/>
-          <w:rPrChange w:id="89" w:author="Isabella" w:date="2026-10-06T20:20:00Z">
+          <w:rPrChange w:id="113" w:author="Isabella" w:date="2026-10-06T20:20:00Z">
             <w:rPr>
               <w:rFonts w:ascii="Times New Roman" w:hAnsi="Times New Roman" w:cs="Times New Roman"/>
               <w:b/>
@@ -818,7 +905,7 @@
           <w:color w:val="000000" w:themeColor="text1"/>
           <w:sz w:val="24"/>
           <w:szCs w:val="24"/>
-          <w:rPrChange w:id="90" w:author="Isabella" w:date="2026-10-06T20:20:00Z">
+          <w:rPrChange w:id="114" w:author="Isabella" w:date="2026-10-06T20:20:00Z">
             <w:rPr>
               <w:rFonts w:ascii="Times New Roman" w:hAnsi="Times New Roman" w:cs="Times New Roman"/>
               <w:b/>
@@ -839,7 +926,7 @@
           <w:color w:val="000000" w:themeColor="text1"/>
           <w:sz w:val="24"/>
           <w:szCs w:val="24"/>
-          <w:rPrChange w:id="91" w:author="Isabella" w:date="2026-10-06T20:20:00Z">
+          <w:rPrChange w:id="115" w:author="Isabella" w:date="2026-10-06T20:20:00Z">
             <w:rPr>
               <w:rFonts w:ascii="Times New Roman" w:hAnsi="Times New Roman" w:cs="Times New Roman"/>
               <w:b/>
@@ -849,7 +936,7 @@
           </w:rPrChange>
         </w:rPr>
       </w:pPr>
-      <w:commentRangeStart w:id="92"/>
+      <w:commentRangeStart w:id="116"/>
       <w:r>
         <w:rPr>
           <w:rFonts w:ascii="Times New Roman" w:hAnsi="Times New Roman" w:cs="Times New Roman"/>
@@ -857,7 +944,7 @@
           <w:color w:val="000000" w:themeColor="text1"/>
           <w:sz w:val="24"/>
           <w:szCs w:val="24"/>
-          <w:rPrChange w:id="93" w:author="Isabella" w:date="2026-10-06T20:20:00Z">
+          <w:rPrChange w:id="117" w:author="Isabella" w:date="2026-10-06T20:20:00Z">
             <w:rPr>
               <w:rFonts w:ascii="Times New Roman" w:hAnsi="Times New Roman" w:cs="Times New Roman"/>
               <w:b/>
@@ -875,7 +962,7 @@
           <w:color w:val="000000" w:themeColor="text1"/>
           <w:sz w:val="24"/>
           <w:szCs w:val="24"/>
-          <w:rPrChange w:id="94" w:author="Isabella" w:date="2026-10-06T20:20:00Z">
+          <w:rPrChange w:id="118" w:author="Isabella" w:date="2026-10-06T20:20:00Z">
             <w:rPr>
               <w:rFonts w:ascii="Times New Roman" w:hAnsi="Times New Roman" w:cs="Times New Roman"/>
               <w:b/>
@@ -886,14 +973,14 @@
         </w:rPr>
         <w:t>S</w:t>
       </w:r>
-      <w:commentRangeEnd w:id="92"/>
+      <w:commentRangeEnd w:id="116"/>
       <w:r>
         <w:rPr>
           <w:b/>
           <w:color w:val="000000" w:themeColor="text1"/>
           <w:sz w:val="24"/>
           <w:szCs w:val="24"/>
-          <w:rPrChange w:id="95" w:author="Isabella" w:date="2026-10-06T20:20:00Z">
+          <w:rPrChange w:id="119" w:author="Isabella" w:date="2026-10-06T20:20:00Z">
             <w:rPr>
               <w:b/>
               <w:sz w:val="24"/>
@@ -901,7 +988,7 @@
             </w:rPr>
           </w:rPrChange>
         </w:rPr>
-        <w:commentReference w:id="92"/>
+        <w:commentReference w:id="116"/>
       </w:r>
     </w:p>
     <w:p>
@@ -912,7 +999,7 @@
           <w:color w:val="000000" w:themeColor="text1"/>
           <w:sz w:val="24"/>
           <w:szCs w:val="24"/>
-          <w:rPrChange w:id="96" w:author="Isabella" w:date="2026-10-06T20:20:00Z">
+          <w:rPrChange w:id="120" w:author="Isabella" w:date="2026-10-06T20:20:00Z">
             <w:rPr>
               <w:rFonts w:ascii="Times New Roman" w:hAnsi="Times New Roman" w:cs="Times New Roman"/>
               <w:sz w:val="24"/>
@@ -926,7 +1013,7 @@
           <w:rFonts w:ascii="Times New Roman" w:hAnsi="Times New Roman"/>
           <w:color w:val="000000" w:themeColor="text1"/>
           <w:sz w:val="24"/>
-          <w:rPrChange w:id="97" w:author="Isabella" w:date="2026-10-06T20:20:00Z">
+          <w:rPrChange w:id="121" w:author="Isabella" w:date="2026-10-06T20:20:00Z">
             <w:rPr>
               <w:rFonts w:ascii="Times New Roman" w:hAnsi="Times New Roman"/>
               <w:color w:val="1F4E79"/>
@@ -945,7 +1032,7 @@
           <w:color w:val="000000" w:themeColor="text1"/>
           <w:sz w:val="24"/>
           <w:szCs w:val="24"/>
-          <w:rPrChange w:id="98" w:author="Isabella" w:date="2026-10-06T20:20:00Z">
+          <w:rPrChange w:id="122" w:author="Isabella" w:date="2026-10-06T20:20:00Z">
             <w:rPr>
               <w:rFonts w:ascii="Times New Roman" w:hAnsi="Times New Roman" w:cs="Times New Roman"/>
               <w:sz w:val="24"/>
@@ -959,7 +1046,7 @@
           <w:rFonts w:ascii="Times New Roman" w:hAnsi="Times New Roman"/>
           <w:color w:val="000000" w:themeColor="text1"/>
           <w:sz w:val="24"/>
-          <w:rPrChange w:id="99" w:author="Isabella" w:date="2026-10-06T20:20:00Z">
+          <w:rPrChange w:id="123" w:author="Isabella" w:date="2026-10-06T20:20:00Z">
             <w:rPr>
               <w:rFonts w:ascii="Times New Roman" w:hAnsi="Times New Roman"/>
               <w:color w:val="1F4E79"/>
@@ -999,7 +1086,7 @@
       </w:r>
     </w:p>
   </w:comment>
-  <w:comment w:id="65" w:author="ANDRÉA" w:date="2021-09-03T12:53:00Z" w:initials="A">
+  <w:comment w:id="89" w:author="ANDRÉA" w:date="2021-09-03T12:53:00Z" w:initials="A">
     <w:p>
       <w:pPr>
         <w:pStyle w:val="Textodecomentrio"/>
@@ -1015,7 +1102,7 @@
       </w:r>
     </w:p>
   </w:comment>
-  <w:comment w:id="92" w:author="ANDRÉA" w:date="2022-03-18T14:03:00Z" w:initials="A">
+  <w:comment w:id="116" w:author="ANDRÉA" w:date="2022-03-18T14:03:00Z" w:initials="A">
     <w:p>
       <w:pPr>
         <w:spacing w:before="200" w:line="240" w:lineRule="auto"/>
@@ -1220,7 +1307,7 @@
           <w:sz w:val="16"/>
           <w:szCs w:val="16"/>
           <w:vertAlign w:val="superscript"/>
-          <w:rPrChange w:id="12" w:author="Isabella" w:date="2026-10-06T19:10:00Z">
+          <w:rPrChange w:id="18" w:author="Isabella" w:date="2026-10-06T19:10:00Z">
             <w:rPr>
               <w:color w:val="FF0000"/>
               <w:vertAlign w:val="superscript"/>
@@ -1234,7 +1321,7 @@
           <w:rFonts w:ascii="Times New Roman" w:hAnsi="Times New Roman" w:cs="Times New Roman"/>
           <w:sz w:val="16"/>
           <w:szCs w:val="16"/>
-          <w:rPrChange w:id="13" w:author="Isabella" w:date="2026-10-06T19:10:00Z">
+          <w:rPrChange w:id="19" w:author="Isabella" w:date="2026-10-06T19:10:00Z">
             <w:rPr>
               <w:color w:val="FF0000"/>
             </w:rPr>
@@ -1242,13 +1329,13 @@
         </w:rPr>
         <w:t xml:space="preserve"> </w:t>
       </w:r>
-      <w:ins w:id="14" w:author="Isabella" w:date="2026-10-06T19:06:00Z">
-        <w:r>
-          <w:rPr>
-            <w:rFonts w:ascii="Times New Roman" w:hAnsi="Times New Roman" w:cs="Times New Roman"/>
-            <w:sz w:val="16"/>
-            <w:szCs w:val="16"/>
-            <w:rPrChange w:id="15" w:author="Isabella" w:date="2026-10-06T19:10:00Z">
+      <w:ins w:id="20" w:author="Isabella" w:date="2026-10-06T19:06:00Z">
+        <w:r>
+          <w:rPr>
+            <w:rFonts w:ascii="Times New Roman" w:hAnsi="Times New Roman" w:cs="Times New Roman"/>
+            <w:sz w:val="16"/>
+            <w:szCs w:val="16"/>
+            <w:rPrChange w:id="21" w:author="Isabella" w:date="2026-10-06T19:10:00Z">
               <w:rPr>
                 <w:color w:val="FF0000"/>
               </w:rPr>
@@ -1257,13 +1344,13 @@
           <w:t>isousa@brazcubas.edu.br</w:t>
         </w:r>
       </w:ins>
-      <w:del w:id="16" w:author="Isabella" w:date="2026-10-06T19:06:00Z">
-        <w:r>
-          <w:rPr>
-            <w:rFonts w:ascii="Times New Roman" w:hAnsi="Times New Roman" w:cs="Times New Roman"/>
-            <w:sz w:val="16"/>
-            <w:szCs w:val="16"/>
-            <w:rPrChange w:id="17" w:author="Isabella" w:date="2026-10-06T19:10:00Z">
+      <w:del w:id="22" w:author="Isabella" w:date="2026-10-06T19:06:00Z">
+        <w:r>
+          <w:rPr>
+            <w:rFonts w:ascii="Times New Roman" w:hAnsi="Times New Roman" w:cs="Times New Roman"/>
+            <w:sz w:val="16"/>
+            <w:szCs w:val="16"/>
+            <w:rPrChange w:id="23" w:author="Isabella" w:date="2026-10-06T19:10:00Z">
               <w:rPr>
                 <w:color w:val="FF0000"/>
               </w:rPr>
@@ -1276,7 +1363,7 @@
             <w:rFonts w:ascii="Times New Roman" w:hAnsi="Times New Roman" w:cs="Times New Roman"/>
             <w:sz w:val="16"/>
             <w:szCs w:val="16"/>
-            <w:rPrChange w:id="18" w:author="Isabella" w:date="2026-10-06T19:10:00Z">
+            <w:rPrChange w:id="24" w:author="Isabella" w:date="2026-10-06T19:10:00Z">
               <w:rPr>
                 <w:rFonts w:ascii="Times New Roman" w:hAnsi="Times New Roman" w:cs="Times New Roman"/>
                 <w:color w:val="FF0000"/>
@@ -1292,7 +1379,7 @@
             <w:rFonts w:ascii="Times New Roman" w:hAnsi="Times New Roman" w:cs="Times New Roman"/>
             <w:sz w:val="16"/>
             <w:szCs w:val="16"/>
-            <w:rPrChange w:id="19" w:author="Isabella" w:date="2026-10-06T19:10:00Z">
+            <w:rPrChange w:id="25" w:author="Isabella" w:date="2026-10-06T19:10:00Z">
               <w:rPr>
                 <w:color w:val="FF0000"/>
               </w:rPr>
@@ -1301,13 +1388,13 @@
           <w:delText xml:space="preserve"> institucional</w:delText>
         </w:r>
       </w:del>
-      <w:del w:id="20" w:author="Isabella" w:date="2026-10-06T19:10:00Z">
-        <w:r>
-          <w:rPr>
-            <w:rFonts w:ascii="Times New Roman" w:hAnsi="Times New Roman" w:cs="Times New Roman"/>
-            <w:sz w:val="16"/>
-            <w:szCs w:val="16"/>
-            <w:rPrChange w:id="21" w:author="Isabella" w:date="2026-10-06T19:10:00Z">
+      <w:del w:id="26" w:author="Isabella" w:date="2026-10-06T19:10:00Z">
+        <w:r>
+          <w:rPr>
+            <w:rFonts w:ascii="Times New Roman" w:hAnsi="Times New Roman" w:cs="Times New Roman"/>
+            <w:sz w:val="16"/>
+            <w:szCs w:val="16"/>
+            <w:rPrChange w:id="27" w:author="Isabella" w:date="2026-10-06T19:10:00Z">
               <w:rPr>
                 <w:color w:val="FF0000"/>
               </w:rPr>
@@ -1316,20 +1403,20 @@
           <w:delText xml:space="preserve"> </w:delText>
         </w:r>
       </w:del>
-      <w:del w:id="22" w:author="Isabella" w:date="2026-10-06T19:09:00Z">
-        <w:r>
-          <w:rPr>
-            <w:rFonts w:ascii="Times New Roman" w:hAnsi="Times New Roman" w:cs="Times New Roman"/>
-            <w:sz w:val="16"/>
-            <w:szCs w:val="16"/>
-            <w:rPrChange w:id="23" w:author="Isabella" w:date="2026-10-06T19:10:00Z">
+      <w:del w:id="28" w:author="Isabella" w:date="2026-10-06T19:09:00Z">
+        <w:r>
+          <w:rPr>
+            <w:rFonts w:ascii="Times New Roman" w:hAnsi="Times New Roman" w:cs="Times New Roman"/>
+            <w:sz w:val="16"/>
+            <w:szCs w:val="16"/>
+            <w:rPrChange w:id="29" w:author="Isabella" w:date="2026-10-06T19:10:00Z">
               <w:rPr/>
             </w:rPrChange>
           </w:rPr>
           <w:delText>-</w:delText>
         </w:r>
       </w:del>
-      <w:ins w:id="24" w:author="Isabella" w:date="2026-10-06T19:10:00Z">
+      <w:ins w:id="30" w:author="Isabella" w:date="2026-10-06T19:10:00Z">
         <w:r>
           <w:rPr>
             <w:rFonts w:ascii="Times New Roman" w:hAnsi="Times New Roman" w:cs="Times New Roman"/>
@@ -1344,13 +1431,13 @@
           <w:rFonts w:ascii="Times New Roman" w:hAnsi="Times New Roman" w:cs="Times New Roman"/>
           <w:sz w:val="16"/>
           <w:szCs w:val="16"/>
-          <w:rPrChange w:id="25" w:author="Isabella" w:date="2026-10-06T19:10:00Z">
+          <w:rPrChange w:id="31" w:author="Isabella" w:date="2026-10-06T19:10:00Z">
             <w:rPr/>
           </w:rPrChange>
         </w:rPr>
         <w:t xml:space="preserve"> </w:t>
       </w:r>
-      <w:del w:id="26" w:author="Isabella" w:date="2026-10-06T19:09:00Z">
+      <w:del w:id="32" w:author="Isabella" w:date="2026-10-06T19:09:00Z">
         <w:r>
           <w:rPr>
             <w:rFonts w:ascii="Times New Roman" w:hAnsi="Times New Roman" w:cs="Times New Roman"/>
@@ -1360,7 +1447,7 @@
           <w:delText xml:space="preserve">Lattes </w:delText>
         </w:r>
       </w:del>
-      <w:ins w:id="27" w:author="Isabella" w:date="2026-10-06T19:09:00Z">
+      <w:ins w:id="33" w:author="Isabella" w:date="2026-10-06T19:09:00Z">
         <w:r>
           <w:rPr>
             <w:rFonts w:ascii="Times New Roman" w:hAnsi="Times New Roman" w:cs="Times New Roman"/>
@@ -1375,7 +1462,7 @@
             <w:sz w:val="16"/>
             <w:szCs w:val="16"/>
             <w:shd w:val="clear" w:color="auto" w:fill="FFFFFF"/>
-            <w:rPrChange w:id="28" w:author="Isabella" w:date="2026-10-06T19:10:00Z">
+            <w:rPrChange w:id="34" w:author="Isabella" w:date="2026-10-06T19:10:00Z">
               <w:rPr>
                 <w:rFonts w:ascii="Tahoma" w:hAnsi="Tahoma" w:cs="Tahoma"/>
                 <w:color w:val="326C99"/>
@@ -1396,7 +1483,7 @@
           <w:t xml:space="preserve"> </w:t>
         </w:r>
       </w:ins>
-      <w:del w:id="29" w:author="Isabella" w:date="2026-10-06T19:09:00Z">
+      <w:del w:id="35" w:author="Isabella" w:date="2026-10-06T19:09:00Z">
         <w:r>
           <w:rPr>
             <w:rFonts w:ascii="Times New Roman" w:hAnsi="Times New Roman" w:cs="Times New Roman"/>
@@ -1406,7 +1493,7 @@
           <w:delText>-</w:delText>
         </w:r>
       </w:del>
-      <w:ins w:id="30" w:author="Isabella" w:date="2026-10-06T19:10:00Z">
+      <w:ins w:id="36" w:author="Isabella" w:date="2026-10-06T19:10:00Z">
         <w:r>
           <w:rPr>
             <w:rFonts w:ascii="Times New Roman" w:hAnsi="Times New Roman" w:cs="Times New Roman"/>
@@ -1424,7 +1511,7 @@
         </w:rPr>
         <w:t xml:space="preserve"> </w:t>
       </w:r>
-      <w:del w:id="31" w:author="Isabella" w:date="2026-10-06T19:09:00Z">
+      <w:del w:id="37" w:author="Isabella" w:date="2026-10-06T19:09:00Z">
         <w:r>
           <w:rPr>
             <w:rFonts w:ascii="Times New Roman" w:hAnsi="Times New Roman" w:cs="Times New Roman"/>
@@ -1442,7 +1529,7 @@
         </w:rPr>
         <w:t>Graduação</w:t>
       </w:r>
-      <w:ins w:id="32" w:author="Isabella" w:date="2026-10-06T19:09:00Z">
+      <w:ins w:id="38" w:author="Isabella" w:date="2026-10-06T19:09:00Z">
         <w:r>
           <w:rPr>
             <w:rFonts w:ascii="Times New Roman" w:hAnsi="Times New Roman" w:cs="Times New Roman"/>
@@ -1460,7 +1547,7 @@
         </w:rPr>
         <w:t xml:space="preserve"> </w:t>
       </w:r>
-      <w:del w:id="33" w:author="Isabella" w:date="2026-10-06T19:10:00Z">
+      <w:del w:id="39" w:author="Isabella" w:date="2026-10-06T19:10:00Z">
         <w:r>
           <w:rPr>
             <w:rFonts w:ascii="Times New Roman" w:hAnsi="Times New Roman" w:cs="Times New Roman"/>
@@ -1470,7 +1557,7 @@
           <w:delText>-</w:delText>
         </w:r>
       </w:del>
-      <w:ins w:id="34" w:author="Isabella" w:date="2026-10-06T19:10:00Z">
+      <w:ins w:id="40" w:author="Isabella" w:date="2026-10-06T19:10:00Z">
         <w:r>
           <w:rPr>
             <w:rFonts w:ascii="Times New Roman" w:hAnsi="Times New Roman" w:cs="Times New Roman"/>
@@ -1488,7 +1575,7 @@
         </w:rPr>
         <w:t xml:space="preserve"> Especialização</w:t>
       </w:r>
-      <w:ins w:id="35" w:author="Isabella" w:date="2026-10-06T19:10:00Z">
+      <w:ins w:id="41" w:author="Isabella" w:date="2026-10-06T19:10:00Z">
         <w:r>
           <w:rPr>
             <w:rFonts w:ascii="Times New Roman" w:hAnsi="Times New Roman" w:cs="Times New Roman"/>
@@ -1498,7 +1585,7 @@
           <w:t xml:space="preserve"> em Algoritmos e Lógica de Programação</w:t>
         </w:r>
       </w:ins>
-      <w:del w:id="36" w:author="Isabella" w:date="2026-10-06T19:10:00Z">
+      <w:del w:id="42" w:author="Isabella" w:date="2026-10-06T19:10:00Z">
         <w:r>
           <w:rPr>
             <w:rFonts w:ascii="Times New Roman" w:hAnsi="Times New Roman" w:cs="Times New Roman"/>
@@ -1512,7 +1599,7 @@
             <w:rFonts w:ascii="Times New Roman" w:hAnsi="Times New Roman" w:cs="Times New Roman"/>
             <w:sz w:val="16"/>
             <w:szCs w:val="16"/>
-            <w:rPrChange w:id="37" w:author="Isabella" w:date="2026-10-06T19:09:00Z">
+            <w:rPrChange w:id="43" w:author="Isabella" w:date="2026-10-06T19:09:00Z">
               <w:rPr/>
             </w:rPrChange>
           </w:rPr>
@@ -1548,12 +1635,40 @@
         </w:rPr>
         <w:t xml:space="preserve"> </w:t>
       </w:r>
+      <w:ins w:id="50" w:author="NATHAN GABRIEL NUNES DOS SANTOS" w:date="2026-10-08T20:25:00Z">
+        <w:r>
+          <w:rPr>
+            <w:rFonts w:ascii="Times New Roman" w:hAnsi="Times New Roman" w:cs="Times New Roman"/>
+            <w:sz w:val="16"/>
+            <w:szCs w:val="16"/>
+          </w:rPr>
+          <w:t>nathan.der.student@gmail.com</w:t>
+        </w:r>
+      </w:ins>
+      <w:del w:id="51" w:author="NATHAN GABRIEL NUNES DOS SANTOS" w:date="2026-10-08T20:25:00Z">
+        <w:r>
+          <w:rPr>
+            <w:rFonts w:ascii="Times New Roman" w:hAnsi="Times New Roman" w:cs="Times New Roman"/>
+            <w:sz w:val="16"/>
+            <w:szCs w:val="16"/>
+            <w:rPrChange w:id="52" w:author="Isabella" w:date="2026-10-06T19:09:00Z">
+              <w:rPr>
+                <w:rFonts w:ascii="Times New Roman" w:hAnsi="Times New Roman" w:cs="Times New Roman"/>
+                <w:color w:val="FF0000"/>
+                <w:sz w:val="16"/>
+                <w:szCs w:val="16"/>
+              </w:rPr>
+            </w:rPrChange>
+          </w:rPr>
+          <w:delText>e-mail</w:delText>
+        </w:r>
+      </w:del>
       <w:r>
         <w:rPr>
           <w:rFonts w:ascii="Times New Roman" w:hAnsi="Times New Roman" w:cs="Times New Roman"/>
           <w:sz w:val="16"/>
           <w:szCs w:val="16"/>
-          <w:rPrChange w:id="41" w:author="Isabella" w:date="2026-10-06T19:09:00Z">
+          <w:rPrChange w:id="53" w:author="Isabella" w:date="2026-10-06T19:09:00Z">
             <w:rPr>
               <w:rFonts w:ascii="Times New Roman" w:hAnsi="Times New Roman" w:cs="Times New Roman"/>
               <w:color w:val="FF0000"/>
@@ -1562,14 +1677,50 @@
             </w:rPr>
           </w:rPrChange>
         </w:rPr>
-        <w:t>e-mail</w:t>
+        <w:t xml:space="preserve"> </w:t>
       </w:r>
       <w:r>
         <w:rPr>
           <w:rFonts w:ascii="Times New Roman" w:hAnsi="Times New Roman" w:cs="Times New Roman"/>
           <w:sz w:val="16"/>
           <w:szCs w:val="16"/>
-          <w:rPrChange w:id="42" w:author="Isabella" w:date="2026-10-06T19:09:00Z">
+        </w:rPr>
+        <w:t xml:space="preserve">- </w:t>
+      </w:r>
+      <w:ins w:id="54" w:author="NATHAN GABRIEL NUNES DOS SANTOS" w:date="2026-10-08T20:26:00Z">
+        <w:r>
+          <w:rPr>
+            <w:rFonts w:ascii="Times New Roman" w:hAnsi="Times New Roman" w:cs="Times New Roman"/>
+            <w:sz w:val="16"/>
+            <w:szCs w:val="16"/>
+          </w:rPr>
+          <w:t>48389722</w:t>
+        </w:r>
+      </w:ins>
+      <w:del w:id="55" w:author="NATHAN GABRIEL NUNES DOS SANTOS" w:date="2026-10-08T20:26:00Z">
+        <w:r>
+          <w:rPr>
+            <w:rFonts w:ascii="Times New Roman" w:hAnsi="Times New Roman" w:cs="Times New Roman"/>
+            <w:sz w:val="16"/>
+            <w:szCs w:val="16"/>
+            <w:rPrChange w:id="56" w:author="Isabella" w:date="2026-10-06T19:09:00Z">
+              <w:rPr>
+                <w:rFonts w:ascii="Times New Roman" w:hAnsi="Times New Roman" w:cs="Times New Roman"/>
+                <w:color w:val="FF0000"/>
+                <w:sz w:val="16"/>
+                <w:szCs w:val="16"/>
+              </w:rPr>
+            </w:rPrChange>
+          </w:rPr>
+          <w:delText>RGM</w:delText>
+        </w:r>
+      </w:del>
+      <w:r>
+        <w:rPr>
+          <w:rFonts w:ascii="Times New Roman" w:hAnsi="Times New Roman" w:cs="Times New Roman"/>
+          <w:sz w:val="16"/>
+          <w:szCs w:val="16"/>
+          <w:rPrChange w:id="57" w:author="Isabella" w:date="2026-10-06T19:09:00Z">
             <w:rPr>
               <w:rFonts w:ascii="Times New Roman" w:hAnsi="Times New Roman" w:cs="Times New Roman"/>
               <w:color w:val="FF0000"/>
@@ -1586,65 +1737,43 @@
           <w:sz w:val="16"/>
           <w:szCs w:val="16"/>
         </w:rPr>
-        <w:t xml:space="preserve">- </w:t>
-      </w:r>
+        <w:t>- Centro Universitário Braz Cubas - Graduando em Análise e Desenvolvimento de Sistemas (</w:t>
+      </w:r>
+      <w:ins w:id="58" w:author="NATHAN GABRIEL NUNES DOS SANTOS" w:date="2026-10-08T20:25:00Z">
+        <w:r>
+          <w:rPr>
+            <w:rFonts w:ascii="Times New Roman" w:hAnsi="Times New Roman" w:cs="Times New Roman"/>
+            <w:sz w:val="16"/>
+            <w:szCs w:val="16"/>
+          </w:rPr>
+          <w:t>2</w:t>
+        </w:r>
+      </w:ins>
+      <w:del w:id="59" w:author="NATHAN GABRIEL NUNES DOS SANTOS" w:date="2026-10-08T20:25:00Z">
+        <w:r>
+          <w:rPr>
+            <w:rFonts w:ascii="Times New Roman" w:hAnsi="Times New Roman" w:cs="Times New Roman"/>
+            <w:sz w:val="16"/>
+            <w:szCs w:val="16"/>
+            <w:rPrChange w:id="60" w:author="Isabella" w:date="2026-10-06T19:09:00Z">
+              <w:rPr>
+                <w:rFonts w:ascii="Times New Roman" w:hAnsi="Times New Roman" w:cs="Times New Roman"/>
+                <w:color w:val="FF0000"/>
+                <w:sz w:val="16"/>
+                <w:szCs w:val="16"/>
+              </w:rPr>
+            </w:rPrChange>
+          </w:rPr>
+          <w:delText>x</w:delText>
+        </w:r>
+      </w:del>
       <w:r>
         <w:rPr>
           <w:rFonts w:ascii="Times New Roman" w:hAnsi="Times New Roman" w:cs="Times New Roman"/>
           <w:sz w:val="16"/>
           <w:szCs w:val="16"/>
-          <w:rPrChange w:id="43" w:author="Isabella" w:date="2026-10-06T19:09:00Z">
-            <w:rPr>
-              <w:rFonts w:ascii="Times New Roman" w:hAnsi="Times New Roman" w:cs="Times New Roman"/>
-              <w:color w:val="FF0000"/>
-              <w:sz w:val="16"/>
-              <w:szCs w:val="16"/>
-            </w:rPr>
-          </w:rPrChange>
-        </w:rPr>
-        <w:t xml:space="preserve">RGM </w:t>
-      </w:r>
-      <w:r>
-        <w:rPr>
-          <w:rFonts w:ascii="Times New Roman" w:hAnsi="Times New Roman" w:cs="Times New Roman"/>
-          <w:sz w:val="16"/>
-          <w:szCs w:val="16"/>
-        </w:rPr>
-        <w:t>- Centro Universitário Braz Cubas - Graduando em Análise e Desenvolvimento de Sistemas (</w:t>
-      </w:r>
-      <w:proofErr w:type="spellStart"/>
-      <w:r>
-        <w:rPr>
-          <w:rFonts w:ascii="Times New Roman" w:hAnsi="Times New Roman" w:cs="Times New Roman"/>
-          <w:sz w:val="16"/>
-          <w:szCs w:val="16"/>
-          <w:rPrChange w:id="44" w:author="Isabella" w:date="2026-10-06T19:09:00Z">
-            <w:rPr>
-              <w:rFonts w:ascii="Times New Roman" w:hAnsi="Times New Roman" w:cs="Times New Roman"/>
-              <w:color w:val="FF0000"/>
-              <w:sz w:val="16"/>
-              <w:szCs w:val="16"/>
-            </w:rPr>
-          </w:rPrChange>
-        </w:rPr>
-        <w:t>x</w:t>
-      </w:r>
-      <w:r>
-        <w:rPr>
-          <w:rFonts w:ascii="Times New Roman" w:hAnsi="Times New Roman" w:cs="Times New Roman"/>
-          <w:sz w:val="16"/>
-          <w:szCs w:val="16"/>
-        </w:rPr>
-        <w:t>º</w:t>
-      </w:r>
-      <w:proofErr w:type="spellEnd"/>
-      <w:r>
-        <w:rPr>
-          <w:rFonts w:ascii="Times New Roman" w:hAnsi="Times New Roman" w:cs="Times New Roman"/>
-          <w:sz w:val="16"/>
-          <w:szCs w:val="16"/>
-        </w:rPr>
-        <w:t xml:space="preserve"> semestre)</w:t>
+        </w:rPr>
+        <w:t>º semestre)</w:t>
       </w:r>
     </w:p>
   </w:footnote>
@@ -1653,110 +1782,103 @@
       <w:pPr>
         <w:pStyle w:val="Textodenotaderodap"/>
         <w:rPr>
+          <w:del w:id="67" w:author="NATHAN GABRIEL NUNES DOS SANTOS" w:date="2026-10-08T20:24:00Z"/>
           <w:rFonts w:ascii="Times New Roman" w:hAnsi="Times New Roman" w:cs="Times New Roman"/>
           <w:sz w:val="16"/>
           <w:szCs w:val="16"/>
         </w:rPr>
       </w:pPr>
-      <w:r>
-        <w:rPr>
-          <w:rStyle w:val="Refdenotaderodap"/>
-          <w:rFonts w:ascii="Times New Roman" w:hAnsi="Times New Roman" w:cs="Times New Roman"/>
-          <w:sz w:val="16"/>
-          <w:szCs w:val="16"/>
-        </w:rPr>
-        <w:footnoteRef/>
-      </w:r>
-      <w:r>
-        <w:rPr>
-          <w:rFonts w:ascii="Times New Roman" w:hAnsi="Times New Roman" w:cs="Times New Roman"/>
-          <w:sz w:val="16"/>
-          <w:szCs w:val="16"/>
-        </w:rPr>
-        <w:t xml:space="preserve"> </w:t>
-      </w:r>
-      <w:r>
-        <w:rPr>
-          <w:rFonts w:ascii="Times New Roman" w:hAnsi="Times New Roman" w:cs="Times New Roman"/>
-          <w:sz w:val="16"/>
-          <w:szCs w:val="16"/>
-          <w:rPrChange w:id="48" w:author="Isabella" w:date="2026-10-06T19:09:00Z">
-            <w:rPr>
-              <w:rFonts w:ascii="Times New Roman" w:hAnsi="Times New Roman" w:cs="Times New Roman"/>
-              <w:color w:val="FF0000"/>
-              <w:sz w:val="16"/>
-              <w:szCs w:val="16"/>
-            </w:rPr>
-          </w:rPrChange>
-        </w:rPr>
-        <w:t xml:space="preserve">e-mail </w:t>
-      </w:r>
-      <w:r>
-        <w:rPr>
-          <w:rFonts w:ascii="Times New Roman" w:hAnsi="Times New Roman" w:cs="Times New Roman"/>
-          <w:sz w:val="16"/>
-          <w:szCs w:val="16"/>
-        </w:rPr>
-        <w:t xml:space="preserve">- </w:t>
-      </w:r>
-      <w:r>
-        <w:rPr>
-          <w:rFonts w:ascii="Times New Roman" w:hAnsi="Times New Roman" w:cs="Times New Roman"/>
-          <w:sz w:val="16"/>
-          <w:szCs w:val="16"/>
-          <w:rPrChange w:id="49" w:author="Isabella" w:date="2026-10-06T19:09:00Z">
-            <w:rPr>
-              <w:rFonts w:ascii="Times New Roman" w:hAnsi="Times New Roman" w:cs="Times New Roman"/>
-              <w:color w:val="FF0000"/>
-              <w:sz w:val="16"/>
-              <w:szCs w:val="16"/>
-            </w:rPr>
-          </w:rPrChange>
-        </w:rPr>
-        <w:t xml:space="preserve">RGM </w:t>
-      </w:r>
-      <w:r>
-        <w:rPr>
-          <w:rFonts w:ascii="Times New Roman" w:hAnsi="Times New Roman" w:cs="Times New Roman"/>
-          <w:sz w:val="16"/>
-          <w:szCs w:val="16"/>
-        </w:rPr>
-        <w:t>- Centro Universitário Braz Cubas - Graduando em Análise e Desenvolvimento de Sistemas (</w:t>
-      </w:r>
-      <w:proofErr w:type="spellStart"/>
-      <w:r>
-        <w:rPr>
-          <w:rFonts w:ascii="Times New Roman" w:hAnsi="Times New Roman" w:cs="Times New Roman"/>
-          <w:sz w:val="16"/>
-          <w:szCs w:val="16"/>
-          <w:rPrChange w:id="50" w:author="Isabella" w:date="2026-10-06T19:09:00Z">
-            <w:rPr>
-              <w:rFonts w:ascii="Times New Roman" w:hAnsi="Times New Roman" w:cs="Times New Roman"/>
-              <w:color w:val="FF0000"/>
-              <w:sz w:val="16"/>
-              <w:szCs w:val="16"/>
-            </w:rPr>
-          </w:rPrChange>
-        </w:rPr>
-        <w:t>x</w:t>
-      </w:r>
-      <w:r>
-        <w:rPr>
-          <w:rFonts w:ascii="Times New Roman" w:hAnsi="Times New Roman" w:cs="Times New Roman"/>
-          <w:sz w:val="16"/>
-          <w:szCs w:val="16"/>
-        </w:rPr>
-        <w:t>º</w:t>
-      </w:r>
-      <w:proofErr w:type="spellEnd"/>
-      <w:r>
-        <w:rPr>
-          <w:rFonts w:ascii="Times New Roman" w:hAnsi="Times New Roman" w:cs="Times New Roman"/>
-          <w:sz w:val="16"/>
-          <w:szCs w:val="16"/>
-        </w:rPr>
-        <w:t xml:space="preserve"> semestre)</w:t>
-      </w:r>
+      <w:del w:id="68" w:author="NATHAN GABRIEL NUNES DOS SANTOS" w:date="2026-10-08T20:24:00Z">
+        <w:r>
+          <w:rPr>
+            <w:rStyle w:val="Refdenotaderodap"/>
+            <w:rFonts w:ascii="Times New Roman" w:hAnsi="Times New Roman" w:cs="Times New Roman"/>
+            <w:sz w:val="16"/>
+            <w:szCs w:val="16"/>
+          </w:rPr>
+          <w:footnoteRef/>
+        </w:r>
+        <w:r>
+          <w:rPr>
+            <w:rFonts w:ascii="Times New Roman" w:hAnsi="Times New Roman" w:cs="Times New Roman"/>
+            <w:sz w:val="16"/>
+            <w:szCs w:val="16"/>
+          </w:rPr>
+          <w:delText xml:space="preserve"> </w:delText>
+        </w:r>
+        <w:r>
+          <w:rPr>
+            <w:rFonts w:ascii="Times New Roman" w:hAnsi="Times New Roman" w:cs="Times New Roman"/>
+            <w:sz w:val="16"/>
+            <w:szCs w:val="16"/>
+            <w:rPrChange w:id="69" w:author="Isabella" w:date="2026-10-06T19:09:00Z">
+              <w:rPr>
+                <w:rFonts w:ascii="Times New Roman" w:hAnsi="Times New Roman" w:cs="Times New Roman"/>
+                <w:color w:val="FF0000"/>
+                <w:sz w:val="16"/>
+                <w:szCs w:val="16"/>
+              </w:rPr>
+            </w:rPrChange>
+          </w:rPr>
+          <w:delText xml:space="preserve">e-mail </w:delText>
+        </w:r>
+        <w:r>
+          <w:rPr>
+            <w:rFonts w:ascii="Times New Roman" w:hAnsi="Times New Roman" w:cs="Times New Roman"/>
+            <w:sz w:val="16"/>
+            <w:szCs w:val="16"/>
+          </w:rPr>
+          <w:delText xml:space="preserve">- </w:delText>
+        </w:r>
+        <w:r>
+          <w:rPr>
+            <w:rFonts w:ascii="Times New Roman" w:hAnsi="Times New Roman" w:cs="Times New Roman"/>
+            <w:sz w:val="16"/>
+            <w:szCs w:val="16"/>
+            <w:rPrChange w:id="70" w:author="Isabella" w:date="2026-10-06T19:09:00Z">
+              <w:rPr>
+                <w:rFonts w:ascii="Times New Roman" w:hAnsi="Times New Roman" w:cs="Times New Roman"/>
+                <w:color w:val="FF0000"/>
+                <w:sz w:val="16"/>
+                <w:szCs w:val="16"/>
+              </w:rPr>
+            </w:rPrChange>
+          </w:rPr>
+          <w:delText xml:space="preserve">RGM </w:delText>
+        </w:r>
+        <w:r>
+          <w:rPr>
+            <w:rFonts w:ascii="Times New Roman" w:hAnsi="Times New Roman" w:cs="Times New Roman"/>
+            <w:sz w:val="16"/>
+            <w:szCs w:val="16"/>
+          </w:rPr>
+          <w:delText>- Centro Universitário Braz Cubas - Graduando em Análise e Desenvolvimento de Sistemas (</w:delText>
+        </w:r>
+        <w:r>
+          <w:rPr>
+            <w:rFonts w:ascii="Times New Roman" w:hAnsi="Times New Roman" w:cs="Times New Roman"/>
+            <w:sz w:val="16"/>
+            <w:szCs w:val="16"/>
+            <w:rPrChange w:id="71" w:author="Isabella" w:date="2026-10-06T19:09:00Z">
+              <w:rPr>
+                <w:rFonts w:ascii="Times New Roman" w:hAnsi="Times New Roman" w:cs="Times New Roman"/>
+                <w:color w:val="FF0000"/>
+                <w:sz w:val="16"/>
+                <w:szCs w:val="16"/>
+              </w:rPr>
+            </w:rPrChange>
+          </w:rPr>
+          <w:delText>x</w:delText>
+        </w:r>
+        <w:r>
+          <w:rPr>
+            <w:rFonts w:ascii="Times New Roman" w:hAnsi="Times New Roman" w:cs="Times New Roman"/>
+            <w:sz w:val="16"/>
+            <w:szCs w:val="16"/>
+          </w:rPr>
+          <w:delText>º semestre)</w:delText>
+        </w:r>
+      </w:del>
     </w:p>
   </w:footnote>
   <w:footnote w:id="4">
@@ -1764,109 +1886,102 @@
       <w:pPr>
         <w:pStyle w:val="Textodenotaderodap"/>
         <w:rPr>
+          <w:del w:id="76" w:author="NATHAN GABRIEL NUNES DOS SANTOS" w:date="2026-10-08T20:24:00Z"/>
           <w:sz w:val="16"/>
           <w:szCs w:val="16"/>
         </w:rPr>
       </w:pPr>
-      <w:r>
-        <w:rPr>
-          <w:rStyle w:val="Refdenotaderodap"/>
-          <w:rFonts w:ascii="Times New Roman" w:hAnsi="Times New Roman" w:cs="Times New Roman"/>
-          <w:sz w:val="16"/>
-          <w:szCs w:val="16"/>
-        </w:rPr>
-        <w:footnoteRef/>
-      </w:r>
-      <w:r>
-        <w:rPr>
-          <w:rFonts w:ascii="Times New Roman" w:hAnsi="Times New Roman" w:cs="Times New Roman"/>
-          <w:sz w:val="16"/>
-          <w:szCs w:val="16"/>
-        </w:rPr>
-        <w:t xml:space="preserve"> </w:t>
-      </w:r>
-      <w:r>
-        <w:rPr>
-          <w:rFonts w:ascii="Times New Roman" w:hAnsi="Times New Roman" w:cs="Times New Roman"/>
-          <w:sz w:val="16"/>
-          <w:szCs w:val="16"/>
-          <w:rPrChange w:id="54" w:author="Isabella" w:date="2026-10-06T19:09:00Z">
-            <w:rPr>
-              <w:rFonts w:ascii="Times New Roman" w:hAnsi="Times New Roman" w:cs="Times New Roman"/>
-              <w:color w:val="FF0000"/>
-              <w:sz w:val="16"/>
-              <w:szCs w:val="16"/>
-            </w:rPr>
-          </w:rPrChange>
-        </w:rPr>
-        <w:t xml:space="preserve">e-mail </w:t>
-      </w:r>
-      <w:r>
-        <w:rPr>
-          <w:rFonts w:ascii="Times New Roman" w:hAnsi="Times New Roman" w:cs="Times New Roman"/>
-          <w:sz w:val="16"/>
-          <w:szCs w:val="16"/>
-        </w:rPr>
-        <w:t xml:space="preserve">- </w:t>
-      </w:r>
-      <w:r>
-        <w:rPr>
-          <w:rFonts w:ascii="Times New Roman" w:hAnsi="Times New Roman" w:cs="Times New Roman"/>
-          <w:sz w:val="16"/>
-          <w:szCs w:val="16"/>
-          <w:rPrChange w:id="55" w:author="Isabella" w:date="2026-10-06T19:09:00Z">
-            <w:rPr>
-              <w:rFonts w:ascii="Times New Roman" w:hAnsi="Times New Roman" w:cs="Times New Roman"/>
-              <w:color w:val="FF0000"/>
-              <w:sz w:val="16"/>
-              <w:szCs w:val="16"/>
-            </w:rPr>
-          </w:rPrChange>
-        </w:rPr>
-        <w:t xml:space="preserve">RGM </w:t>
-      </w:r>
-      <w:r>
-        <w:rPr>
-          <w:rFonts w:ascii="Times New Roman" w:hAnsi="Times New Roman" w:cs="Times New Roman"/>
-          <w:sz w:val="16"/>
-          <w:szCs w:val="16"/>
-        </w:rPr>
-        <w:t>- Centro Universitário Braz Cubas - Graduando em Análise e Desenvolvimento de Sistemas (</w:t>
-      </w:r>
-      <w:proofErr w:type="spellStart"/>
-      <w:r>
-        <w:rPr>
-          <w:rFonts w:ascii="Times New Roman" w:hAnsi="Times New Roman" w:cs="Times New Roman"/>
-          <w:sz w:val="16"/>
-          <w:szCs w:val="16"/>
-          <w:rPrChange w:id="56" w:author="Isabella" w:date="2026-10-06T19:09:00Z">
-            <w:rPr>
-              <w:rFonts w:ascii="Times New Roman" w:hAnsi="Times New Roman" w:cs="Times New Roman"/>
-              <w:color w:val="FF0000"/>
-              <w:sz w:val="16"/>
-              <w:szCs w:val="16"/>
-            </w:rPr>
-          </w:rPrChange>
-        </w:rPr>
-        <w:t>x</w:t>
-      </w:r>
-      <w:r>
-        <w:rPr>
-          <w:rFonts w:ascii="Times New Roman" w:hAnsi="Times New Roman" w:cs="Times New Roman"/>
-          <w:sz w:val="16"/>
-          <w:szCs w:val="16"/>
-        </w:rPr>
-        <w:t>º</w:t>
-      </w:r>
-      <w:proofErr w:type="spellEnd"/>
-      <w:r>
-        <w:rPr>
-          <w:rFonts w:ascii="Times New Roman" w:hAnsi="Times New Roman" w:cs="Times New Roman"/>
-          <w:sz w:val="16"/>
-          <w:szCs w:val="16"/>
-        </w:rPr>
-        <w:t xml:space="preserve"> semestre)</w:t>
-      </w:r>
+      <w:del w:id="77" w:author="NATHAN GABRIEL NUNES DOS SANTOS" w:date="2026-10-08T20:24:00Z">
+        <w:r>
+          <w:rPr>
+            <w:rStyle w:val="Refdenotaderodap"/>
+            <w:rFonts w:ascii="Times New Roman" w:hAnsi="Times New Roman" w:cs="Times New Roman"/>
+            <w:sz w:val="16"/>
+            <w:szCs w:val="16"/>
+          </w:rPr>
+          <w:footnoteRef/>
+        </w:r>
+        <w:r>
+          <w:rPr>
+            <w:rFonts w:ascii="Times New Roman" w:hAnsi="Times New Roman" w:cs="Times New Roman"/>
+            <w:sz w:val="16"/>
+            <w:szCs w:val="16"/>
+          </w:rPr>
+          <w:delText xml:space="preserve"> </w:delText>
+        </w:r>
+        <w:r>
+          <w:rPr>
+            <w:rFonts w:ascii="Times New Roman" w:hAnsi="Times New Roman" w:cs="Times New Roman"/>
+            <w:sz w:val="16"/>
+            <w:szCs w:val="16"/>
+            <w:rPrChange w:id="78" w:author="Isabella" w:date="2026-10-06T19:09:00Z">
+              <w:rPr>
+                <w:rFonts w:ascii="Times New Roman" w:hAnsi="Times New Roman" w:cs="Times New Roman"/>
+                <w:color w:val="FF0000"/>
+                <w:sz w:val="16"/>
+                <w:szCs w:val="16"/>
+              </w:rPr>
+            </w:rPrChange>
+          </w:rPr>
+          <w:delText xml:space="preserve">e-mail </w:delText>
+        </w:r>
+        <w:r>
+          <w:rPr>
+            <w:rFonts w:ascii="Times New Roman" w:hAnsi="Times New Roman" w:cs="Times New Roman"/>
+            <w:sz w:val="16"/>
+            <w:szCs w:val="16"/>
+          </w:rPr>
+          <w:delText xml:space="preserve">- </w:delText>
+        </w:r>
+        <w:r>
+          <w:rPr>
+            <w:rFonts w:ascii="Times New Roman" w:hAnsi="Times New Roman" w:cs="Times New Roman"/>
+            <w:sz w:val="16"/>
+            <w:szCs w:val="16"/>
+            <w:rPrChange w:id="79" w:author="Isabella" w:date="2026-10-06T19:09:00Z">
+              <w:rPr>
+                <w:rFonts w:ascii="Times New Roman" w:hAnsi="Times New Roman" w:cs="Times New Roman"/>
+                <w:color w:val="FF0000"/>
+                <w:sz w:val="16"/>
+                <w:szCs w:val="16"/>
+              </w:rPr>
+            </w:rPrChange>
+          </w:rPr>
+          <w:delText xml:space="preserve">RGM </w:delText>
+        </w:r>
+        <w:r>
+          <w:rPr>
+            <w:rFonts w:ascii="Times New Roman" w:hAnsi="Times New Roman" w:cs="Times New Roman"/>
+            <w:sz w:val="16"/>
+            <w:szCs w:val="16"/>
+          </w:rPr>
+          <w:delText>- Centro Universitário Braz Cubas - Graduando em Análise e Desenvolvimento de Sistemas (</w:delText>
+        </w:r>
+        <w:r>
+          <w:rPr>
+            <w:rFonts w:ascii="Times New Roman" w:hAnsi="Times New Roman" w:cs="Times New Roman"/>
+            <w:sz w:val="16"/>
+            <w:szCs w:val="16"/>
+            <w:rPrChange w:id="80" w:author="Isabella" w:date="2026-10-06T19:09:00Z">
+              <w:rPr>
+                <w:rFonts w:ascii="Times New Roman" w:hAnsi="Times New Roman" w:cs="Times New Roman"/>
+                <w:color w:val="FF0000"/>
+                <w:sz w:val="16"/>
+                <w:szCs w:val="16"/>
+              </w:rPr>
+            </w:rPrChange>
+          </w:rPr>
+          <w:delText>x</w:delText>
+        </w:r>
+        <w:r>
+          <w:rPr>
+            <w:rFonts w:ascii="Times New Roman" w:hAnsi="Times New Roman" w:cs="Times New Roman"/>
+            <w:sz w:val="16"/>
+            <w:szCs w:val="16"/>
+          </w:rPr>
+          <w:delText>º semestre)</w:delText>
+        </w:r>
+      </w:del>
     </w:p>
   </w:footnote>
 </w:footnotes>
@@ -1946,6 +2061,9 @@
 <w15:people xmlns:wpc="http://schemas.microsoft.com/office/word/2010/wordprocessingCanvas" xmlns:cx="http://schemas.microsoft.com/office/drawing/2014/chartex" xmlns:cx1="http://schemas.microsoft.com/office/drawing/2015/9/8/chartex" xmlns:cx2="http://schemas.microsoft.com/office/drawing/2015/10/21/chartex" xmlns:cx3="http://schemas.microsoft.com/office/drawing/2016/5/9/chartex" xmlns:cx4="http://schemas.microsoft.com/office/drawing/2016/5/10/chartex" xmlns:cx5="http://schemas.microsoft.com/office/drawing/2016/5/11/chartex" xmlns:cx6="http://schemas.microsoft.com/office/drawing/2016/5/12/chartex" xmlns:cx7="http://schemas.microsoft.com/office/drawing/2016/5/13/chartex" xmlns:cx8="http://schemas.microsoft.com/office/drawing/2016/5/14/chartex" xmlns:mc="http://schemas.openxmlformats.org/markup-compatibility/2006" xmlns:aink="http://schemas.microsoft.com/office/drawing/2016/ink" xmlns:am3d="http://schemas.microsoft.com/office/drawing/2017/model3d" xmlns:o="urn:schemas-microsoft-com:office:office" xmlns:r="http://schemas.openxmlformats.org/officeDocument/2006/relationships" xmlns:m="http://schemas.openxmlformats.org/officeDocument/2006/math" xmlns:v="urn:schemas-microsoft-com:vml" xmlns:wp14="http://schemas.microsoft.com/office/word/2010/wordprocessingDrawing" xmlns:wp="http://schemas.openxmlformats.org/drawingml/2006/wordprocessingDrawing" xmlns:w10="urn:schemas-microsoft-com:office:word" xmlns:w="http://schemas.openxmlformats.org/wordprocessingml/2006/main" xmlns:w14="http://schemas.microsoft.com/office/word/2010/wordml" xmlns:w15="http://schemas.microsoft.com/office/word/2012/wordml" xmlns:w16cex="http://schemas.microsoft.com/office/word/2018/wordml/cex" xmlns:w16cid="http://schemas.microsoft.com/office/word/2016/wordml/cid" xmlns:w16="http://schemas.microsoft.com/office/word/2018/wordml" xmlns:w16sdtdh="http://schemas.microsoft.com/office/word/2020/wordml/sdtdatahash" xmlns:w16se="http://schemas.microsoft.com/office/word/2015/wordml/symex" xmlns:wpg="http://schemas.microsoft.com/office/word/2010/wordprocessingGroup" xmlns:wpi="http://schemas.microsoft.com/office/word/2010/wordprocessingInk" xmlns:wne="http://schemas.microsoft.com/office/word/2006/wordml" xmlns:wps="http://schemas.microsoft.com/office/word/2010/wordprocessingShape" mc:Ignorable="w14 w15 w16se w16cid w16 w16cex w16sdtdh wp14">
   <w15:person w15:author="Isabella">
     <w15:presenceInfo w15:providerId="AD" w15:userId="S::isousa@pf.brazcubas.edu.br::54db16e1-b3c5-4b78-a2be-3bfe28968c17"/>
+  </w15:person>
+  <w15:person w15:author="NATHAN GABRIEL NUNES DOS SANTOS">
+    <w15:presenceInfo w15:providerId="AD" w15:userId="S::nathan.santos006@cs.brazcubas.edu.br::1e94aeb7-da0d-4e35-9a79-185f1df84c2f"/>
   </w15:person>
 </w15:people>
 </file>

</xml_diff>